<commit_message>
Save today's SEO work, client deliverables, and workflow updates
</commit_message>
<xml_diff>
--- a/evaluations/runs/2026-09-15-family-law-core-hub-workflow/synthetic-divorce-core.docx
+++ b/evaluations/runs/2026-09-15-family-law-core-hub-workflow/synthetic-divorce-core.docx
@@ -219,7 +219,7 @@
         </w:rPr>
         <w:t xml:space="preserve">A cooperative planning section could introduce a focused </w:t>
       </w:r>
-      <w:hyperlink w:history="1" r:id="rIdsdtkrmvzkhyls8uwyoqgz">
+      <w:hyperlink w:history="1" r:id="rIdyutrogzfjsew1gs4xfojv">
         <w:r>
           <w:rPr>
             <w:rFonts w:ascii="Arial" w:cs="Arial" w:eastAsia="Arial" w:hAnsi="Arial"/>
@@ -265,7 +265,7 @@
         </w:rPr>
         <w:t xml:space="preserve">A section about unresolved disputes could lead into a focused </w:t>
       </w:r>
-      <w:hyperlink w:history="1" r:id="rId-t82cq1klwmhetvrqfwdf">
+      <w:hyperlink w:history="1" r:id="rIdnnpuiwgpnuxb1vzhohlqr">
         <w:r>
           <w:rPr>
             <w:rFonts w:ascii="Arial" w:cs="Arial" w:eastAsia="Arial" w:hAnsi="Arial"/>
@@ -311,7 +311,7 @@
         </w:rPr>
         <w:t xml:space="preserve">A discussion of supported conversation could mention a dedicated </w:t>
       </w:r>
-      <w:hyperlink w:history="1" r:id="rIdzrey0e87clgl1u2qusofw">
+      <w:hyperlink w:history="1" r:id="rIdhwmnlqtlgce8ep6cwobls">
         <w:r>
           <w:rPr>
             <w:rFonts w:ascii="Arial" w:cs="Arial" w:eastAsia="Arial" w:hAnsi="Arial"/>
@@ -357,7 +357,7 @@
         </w:rPr>
         <w:t xml:space="preserve">A reader comparing relationship-status options could encounter a separate </w:t>
       </w:r>
-      <w:hyperlink w:history="1" r:id="rIddjyldtmaoha2youg5qcmv">
+      <w:hyperlink w:history="1" r:id="rIds53rwtclepncthsewi1lw">
         <w:r>
           <w:rPr>
             <w:rFonts w:ascii="Arial" w:cs="Arial" w:eastAsia="Arial" w:hAnsi="Arial"/>
@@ -403,7 +403,7 @@
         </w:rPr>
         <w:t xml:space="preserve">A section about agreement and preparation could point to an </w:t>
       </w:r>
-      <w:hyperlink w:history="1" r:id="rIdsd1ar1idvvinedstzs0wa">
+      <w:hyperlink w:history="1" r:id="rIdvgt8rcztld2sirvut5e3k">
         <w:r>
           <w:rPr>
             <w:rFonts w:ascii="Arial" w:cs="Arial" w:eastAsia="Arial" w:hAnsi="Arial"/>

</xml_diff>